<commit_message>
Replace ServiceTitan with MWR Life in DBA base
</commit_message>
<xml_diff>
--- a/Base/Pedro_Gutierrez_CV_SQL_Server_DBA.docx
+++ b/Base/Pedro_Gutierrez_CV_SQL_Server_DBA.docx
@@ -432,7 +432,7 @@
                 <w:i w:val="0"/>
                 <w:sz w:val="16"/>
               </w:rPr>
-              <w:t>Reduced manual processing by up to 40% and Snowflake warehouse processing time by 20%</w:t>
+              <w:t>Reduced manual processing by up to 40% and improved data validation accuracy by 30%</w:t>
             </w:r>
           </w:p>
         </w:tc>
@@ -608,7 +608,7 @@
           <w:color w:val="5B5B5B"/>
           <w:sz w:val="17"/>
         </w:rPr>
-        <w:t>Present</w:t>
+        <w:t>September 2024 - Present | Remote / Costa Rica</w:t>
       </w:r>
     </w:p>
     <w:p>
@@ -743,116 +743,6 @@
       <w:pPr>
         <w:keepNext/>
         <w:pageBreakBefore/>
-        <w:spacing w:before="100" w:after="20"/>
-      </w:pPr>
-      <w:r>
-        <w:rPr>
-          <w:rFonts w:ascii="Aptos" w:hAnsi="Aptos"/>
-          <w:b/>
-          <w:i w:val="0"/>
-          <w:color w:val="222222"/>
-          <w:sz w:val="20"/>
-        </w:rPr>
-        <w:t>Snowflake Developer / Data Engineer | ServiceTitan</w:t>
-      </w:r>
-    </w:p>
-    <w:p>
-      <w:pPr>
-        <w:keepNext/>
-        <w:spacing w:after="40"/>
-      </w:pPr>
-      <w:r>
-        <w:rPr>
-          <w:rFonts w:ascii="Aptos" w:hAnsi="Aptos"/>
-          <w:b w:val="0"/>
-          <w:i/>
-          <w:color w:val="5B5B5B"/>
-          <w:sz w:val="17"/>
-        </w:rPr>
-        <w:t>September 2024 - Present | Remote / Costa Rica</w:t>
-      </w:r>
-    </w:p>
-    <w:p>
-      <w:pPr>
-        <w:pStyle w:val="ListBullet"/>
-        <w:keepLines/>
-        <w:spacing w:after="20" w:line="245" w:lineRule="auto"/>
-        <w:ind w:left="259" w:hanging="173"/>
-      </w:pPr>
-      <w:r>
-        <w:rPr>
-          <w:rFonts w:ascii="Aptos" w:hAnsi="Aptos"/>
-          <w:b w:val="0"/>
-          <w:i w:val="0"/>
-          <w:sz w:val="18"/>
-        </w:rPr>
-        <w:t>Migrate C# reporting logic into Snowflake SQL and maintain dbt models across silver and gold data layers.</w:t>
-      </w:r>
-    </w:p>
-    <w:p>
-      <w:pPr>
-        <w:pStyle w:val="ListBullet"/>
-        <w:keepLines/>
-        <w:spacing w:after="20" w:line="245" w:lineRule="auto"/>
-        <w:ind w:left="259" w:hanging="173"/>
-      </w:pPr>
-      <w:r>
-        <w:rPr>
-          <w:rFonts w:ascii="Aptos" w:hAnsi="Aptos"/>
-          <w:b w:val="0"/>
-          <w:i w:val="0"/>
-          <w:sz w:val="18"/>
-        </w:rPr>
-        <w:t>Optimize Snowflake SQL and dbt workloads, reducing warehouse processing time by 20% during an initial improvement phase.</w:t>
-      </w:r>
-    </w:p>
-    <w:p>
-      <w:pPr>
-        <w:pStyle w:val="ListBullet"/>
-        <w:keepLines/>
-        <w:spacing w:after="20" w:line="245" w:lineRule="auto"/>
-        <w:ind w:left="259" w:hanging="173"/>
-      </w:pPr>
-      <w:r>
-        <w:rPr>
-          <w:rFonts w:ascii="Aptos" w:hAnsi="Aptos"/>
-          <w:b w:val="0"/>
-          <w:i w:val="0"/>
-          <w:sz w:val="18"/>
-        </w:rPr>
-        <w:t>Created a Kimball-based warehouse modeling proof of concept and support MetricFlow semantic models and Snowflake Cortex workflows.</w:t>
-      </w:r>
-    </w:p>
-    <w:p>
-      <w:pPr>
-        <w:keepLines/>
-        <w:spacing w:after="40"/>
-      </w:pPr>
-      <w:r>
-        <w:rPr>
-          <w:rFonts w:ascii="Aptos" w:hAnsi="Aptos"/>
-          <w:b/>
-          <w:i w:val="0"/>
-          <w:color w:val="222222"/>
-          <w:sz w:val="17"/>
-        </w:rPr>
-        <w:t xml:space="preserve">Technologies: </w:t>
-      </w:r>
-      <w:r>
-        <w:rPr>
-          <w:rFonts w:ascii="Aptos" w:hAnsi="Aptos"/>
-          <w:b w:val="0"/>
-          <w:i w:val="0"/>
-          <w:color w:val="5B5B5B"/>
-          <w:sz w:val="17"/>
-        </w:rPr>
-        <w:t>Snowflake, Snowflake SQL, dbt, MetricFlow, Kimball, Snowflake Cortex, Cursor, Git</w:t>
-      </w:r>
-    </w:p>
-    <w:p>
-      <w:pPr>
-        <w:keepNext/>
-        <w:pageBreakBefore w:val="0"/>
         <w:spacing w:before="100" w:after="20"/>
       </w:pPr>
       <w:r>

</xml_diff>